<commit_message>
v1.2: add CONSORT 2010 for randomised trial reports
- New references/consort-2010.md (25-item checklist); SKILL.md routing row,
  detection cue, tool list/description updated; version -> 1.2; CHANGELOG 1.2
- Updated the 3 docs: README.md, README.html (tool lists, routing, version,
  "Auditable by design" note), and the deck (CONSORT chip + routing row)
- Refreshed the Microsoft 365 pack (agent routing + regenerated knowledge .md/.docx)
- Repackaged installer (now 10 files)

Co-Authored-By: Claude Opus 4.8 <noreply@anthropic.com>
</commit_message>
<xml_diff>
--- a/copilot-m365/knowledge-checklists.docx
+++ b/copilot-m365/knowledge-checklists.docx
@@ -5564,8 +5564,1229 @@
         <w:t xml:space="preserve">CONSORT is the right tool — flag this rather than forcing SPIRIT.</w:t>
       </w:r>
     </w:p>
+    <w:p>
+      <w:r>
+        <w:pict>
+          <v:rect style="width:0;height:1.5pt" o:hralign="center" o:hrstd="t" o:hr="t"/>
+        </w:pict>
+      </w:r>
+    </w:p>
     <w:bookmarkEnd w:id="46"/>
     <w:bookmarkEnd w:id="47"/>
+    <w:bookmarkStart w:id="55" w:name="X17a1f8721423073dad376252d11133786566bb8"/>
+    <w:p>
+      <w:pPr>
+        <w:pStyle w:val="Heading1"/>
+      </w:pPr>
+      <w:r>
+        <w:t xml:space="preserve">CONSORT 2010 — reporting checklist for randomised controlled trials</w:t>
+      </w:r>
+    </w:p>
+    <w:p>
+      <w:pPr>
+        <w:pStyle w:val="FirstParagraph"/>
+      </w:pPr>
+      <w:r>
+        <w:t xml:space="preserve">Source: Schulz KF, Altman DG, Moher D; CONSORT Group. CONSORT 2010 Statement:</w:t>
+      </w:r>
+      <w:r>
+        <w:t xml:space="preserve"> </w:t>
+      </w:r>
+      <w:r>
+        <w:t xml:space="preserve">updated guidelines for reporting parallel group randomised trials. BMJ 2010;340:c332.</w:t>
+      </w:r>
+    </w:p>
+    <w:p>
+      <w:pPr>
+        <w:pStyle w:val="BodyText"/>
+      </w:pPr>
+      <w:r>
+        <w:t xml:space="preserve">Apply to an</w:t>
+      </w:r>
+      <w:r>
+        <w:t xml:space="preserve"> </w:t>
+      </w:r>
+      <w:r>
+        <w:rPr>
+          <w:b/>
+          <w:bCs/>
+        </w:rPr>
+        <w:t xml:space="preserve">individual randomised controlled trial (RCT) report</w:t>
+      </w:r>
+      <w:r>
+        <w:t xml:space="preserve"> </w:t>
+      </w:r>
+      <w:r>
+        <w:t xml:space="preserve">— a single trial</w:t>
+      </w:r>
+      <w:r>
+        <w:t xml:space="preserve"> </w:t>
+      </w:r>
+      <w:r>
+        <w:t xml:space="preserve">manuscript, not a systematic review (use PRISMA) and not a trial protocol (use</w:t>
+      </w:r>
+      <w:r>
+        <w:t xml:space="preserve"> </w:t>
+      </w:r>
+      <w:r>
+        <w:t xml:space="preserve">SPIRIT). CONSORT is a</w:t>
+      </w:r>
+      <w:r>
+        <w:t xml:space="preserve"> </w:t>
+      </w:r>
+      <w:r>
+        <w:rPr>
+          <w:b/>
+          <w:bCs/>
+        </w:rPr>
+        <w:t xml:space="preserve">reporting</w:t>
+      </w:r>
+      <w:r>
+        <w:t xml:space="preserve"> </w:t>
+      </w:r>
+      <w:r>
+        <w:t xml:space="preserve">guideline: it checks whether the completed trial</w:t>
+      </w:r>
+      <w:r>
+        <w:t xml:space="preserve"> </w:t>
+      </w:r>
+      <w:r>
+        <w:t xml:space="preserve">is described completely and transparently, not its risk of bias (for that, appraise</w:t>
+      </w:r>
+      <w:r>
+        <w:t xml:space="preserve"> </w:t>
+      </w:r>
+      <w:r>
+        <w:t xml:space="preserve">the RCT with Cochrane RoB 2 — see the notes below).</w:t>
+      </w:r>
+    </w:p>
+    <w:p>
+      <w:pPr>
+        <w:pStyle w:val="BodyText"/>
+      </w:pPr>
+      <w:r>
+        <w:t xml:space="preserve">Rate each item ✅ Yes · 🟡 Partial · ❌ Not reported, with location and comment. No</w:t>
+      </w:r>
+      <w:r>
+        <w:t xml:space="preserve"> </w:t>
+      </w:r>
+      <w:r>
+        <w:t xml:space="preserve">summed score — report the counts and overall completeness (High / Moderate / Low).</w:t>
+      </w:r>
+    </w:p>
+    <w:bookmarkStart w:id="48" w:name="title-and-abstract"/>
+    <w:p>
+      <w:pPr>
+        <w:pStyle w:val="Heading2"/>
+      </w:pPr>
+      <w:r>
+        <w:t xml:space="preserve">Title and abstract</w:t>
+      </w:r>
+    </w:p>
+    <w:p>
+      <w:pPr>
+        <w:pStyle w:val="Compact"/>
+        <w:numPr>
+          <w:ilvl w:val="0"/>
+          <w:numId w:val="1027"/>
+        </w:numPr>
+      </w:pPr>
+      <w:r>
+        <w:rPr>
+          <w:b/>
+          <w:bCs/>
+        </w:rPr>
+        <w:t xml:space="preserve">1a. Title</w:t>
+      </w:r>
+      <w:r>
+        <w:t xml:space="preserve"> </w:t>
+      </w:r>
+      <w:r>
+        <w:t xml:space="preserve">— Identification as a randomised trial in the title.</w:t>
+      </w:r>
+    </w:p>
+    <w:p>
+      <w:pPr>
+        <w:pStyle w:val="Compact"/>
+        <w:numPr>
+          <w:ilvl w:val="0"/>
+          <w:numId w:val="1027"/>
+        </w:numPr>
+      </w:pPr>
+      <w:r>
+        <w:rPr>
+          <w:b/>
+          <w:bCs/>
+        </w:rPr>
+        <w:t xml:space="preserve">1b. Abstract</w:t>
+      </w:r>
+      <w:r>
+        <w:t xml:space="preserve"> </w:t>
+      </w:r>
+      <w:r>
+        <w:t xml:space="preserve">— Structured summary of trial design, methods, results, and conclusions (see CONSORT for Abstracts).</w:t>
+      </w:r>
+    </w:p>
+    <w:bookmarkEnd w:id="48"/>
+    <w:bookmarkStart w:id="49" w:name="introduction-3"/>
+    <w:p>
+      <w:pPr>
+        <w:pStyle w:val="Heading2"/>
+      </w:pPr>
+      <w:r>
+        <w:t xml:space="preserve">Introduction</w:t>
+      </w:r>
+    </w:p>
+    <w:p>
+      <w:pPr>
+        <w:pStyle w:val="Compact"/>
+        <w:numPr>
+          <w:ilvl w:val="0"/>
+          <w:numId w:val="1028"/>
+        </w:numPr>
+      </w:pPr>
+      <w:r>
+        <w:rPr>
+          <w:b/>
+          <w:bCs/>
+        </w:rPr>
+        <w:t xml:space="preserve">2a. Background</w:t>
+      </w:r>
+      <w:r>
+        <w:t xml:space="preserve"> </w:t>
+      </w:r>
+      <w:r>
+        <w:t xml:space="preserve">— Scientific background and explanation of rationale.</w:t>
+      </w:r>
+    </w:p>
+    <w:p>
+      <w:pPr>
+        <w:pStyle w:val="Compact"/>
+        <w:numPr>
+          <w:ilvl w:val="0"/>
+          <w:numId w:val="1028"/>
+        </w:numPr>
+      </w:pPr>
+      <w:r>
+        <w:rPr>
+          <w:b/>
+          <w:bCs/>
+        </w:rPr>
+        <w:t xml:space="preserve">2b. Objectives</w:t>
+      </w:r>
+      <w:r>
+        <w:t xml:space="preserve"> </w:t>
+      </w:r>
+      <w:r>
+        <w:t xml:space="preserve">— Specific objectives or hypotheses.</w:t>
+      </w:r>
+    </w:p>
+    <w:bookmarkEnd w:id="49"/>
+    <w:bookmarkStart w:id="50" w:name="methods-2"/>
+    <w:p>
+      <w:pPr>
+        <w:pStyle w:val="Heading2"/>
+      </w:pPr>
+      <w:r>
+        <w:t xml:space="preserve">Methods</w:t>
+      </w:r>
+    </w:p>
+    <w:p>
+      <w:pPr>
+        <w:pStyle w:val="Compact"/>
+        <w:numPr>
+          <w:ilvl w:val="0"/>
+          <w:numId w:val="1029"/>
+        </w:numPr>
+      </w:pPr>
+      <w:r>
+        <w:rPr>
+          <w:b/>
+          <w:bCs/>
+        </w:rPr>
+        <w:t xml:space="preserve">3a. Trial design</w:t>
+      </w:r>
+      <w:r>
+        <w:t xml:space="preserve"> </w:t>
+      </w:r>
+      <w:r>
+        <w:t xml:space="preserve">— Description (e.g. parallel, factorial) including allocation ratio.</w:t>
+      </w:r>
+    </w:p>
+    <w:p>
+      <w:pPr>
+        <w:pStyle w:val="Compact"/>
+        <w:numPr>
+          <w:ilvl w:val="0"/>
+          <w:numId w:val="1029"/>
+        </w:numPr>
+      </w:pPr>
+      <w:r>
+        <w:rPr>
+          <w:b/>
+          <w:bCs/>
+        </w:rPr>
+        <w:t xml:space="preserve">3b. Changes to design</w:t>
+      </w:r>
+      <w:r>
+        <w:t xml:space="preserve"> </w:t>
+      </w:r>
+      <w:r>
+        <w:t xml:space="preserve">— Important changes to methods after commencement (e.g. eligibility), with reasons.</w:t>
+      </w:r>
+    </w:p>
+    <w:p>
+      <w:pPr>
+        <w:pStyle w:val="Compact"/>
+        <w:numPr>
+          <w:ilvl w:val="0"/>
+          <w:numId w:val="1029"/>
+        </w:numPr>
+      </w:pPr>
+      <w:r>
+        <w:rPr>
+          <w:b/>
+          <w:bCs/>
+        </w:rPr>
+        <w:t xml:space="preserve">4a. Participants — eligibility</w:t>
+      </w:r>
+      <w:r>
+        <w:t xml:space="preserve"> </w:t>
+      </w:r>
+      <w:r>
+        <w:t xml:space="preserve">— Eligibility criteria for participants.</w:t>
+      </w:r>
+    </w:p>
+    <w:p>
+      <w:pPr>
+        <w:pStyle w:val="Compact"/>
+        <w:numPr>
+          <w:ilvl w:val="0"/>
+          <w:numId w:val="1029"/>
+        </w:numPr>
+      </w:pPr>
+      <w:r>
+        <w:rPr>
+          <w:b/>
+          <w:bCs/>
+        </w:rPr>
+        <w:t xml:space="preserve">4b. Settings</w:t>
+      </w:r>
+      <w:r>
+        <w:t xml:space="preserve"> </w:t>
+      </w:r>
+      <w:r>
+        <w:t xml:space="preserve">— Settings and locations where the data were collected.</w:t>
+      </w:r>
+    </w:p>
+    <w:p>
+      <w:pPr>
+        <w:pStyle w:val="Compact"/>
+        <w:numPr>
+          <w:ilvl w:val="0"/>
+          <w:numId w:val="1029"/>
+        </w:numPr>
+      </w:pPr>
+      <w:r>
+        <w:rPr>
+          <w:b/>
+          <w:bCs/>
+        </w:rPr>
+        <w:t xml:space="preserve">5. Interventions</w:t>
+      </w:r>
+      <w:r>
+        <w:t xml:space="preserve"> </w:t>
+      </w:r>
+      <w:r>
+        <w:t xml:space="preserve">— Interventions for each group in enough detail to replicate, including how and when they were administered.</w:t>
+      </w:r>
+    </w:p>
+    <w:p>
+      <w:pPr>
+        <w:pStyle w:val="Compact"/>
+        <w:numPr>
+          <w:ilvl w:val="0"/>
+          <w:numId w:val="1029"/>
+        </w:numPr>
+      </w:pPr>
+      <w:r>
+        <w:rPr>
+          <w:b/>
+          <w:bCs/>
+        </w:rPr>
+        <w:t xml:space="preserve">6a. Outcomes</w:t>
+      </w:r>
+      <w:r>
+        <w:t xml:space="preserve"> </w:t>
+      </w:r>
+      <w:r>
+        <w:t xml:space="preserve">— Completely defined pre-specified primary and secondary outcomes, including how and when assessed.</w:t>
+      </w:r>
+    </w:p>
+    <w:p>
+      <w:pPr>
+        <w:pStyle w:val="Compact"/>
+        <w:numPr>
+          <w:ilvl w:val="0"/>
+          <w:numId w:val="1029"/>
+        </w:numPr>
+      </w:pPr>
+      <w:r>
+        <w:rPr>
+          <w:b/>
+          <w:bCs/>
+        </w:rPr>
+        <w:t xml:space="preserve">6b. Changes to outcomes</w:t>
+      </w:r>
+      <w:r>
+        <w:t xml:space="preserve"> </w:t>
+      </w:r>
+      <w:r>
+        <w:t xml:space="preserve">— Any changes after the trial began, with reasons.</w:t>
+      </w:r>
+    </w:p>
+    <w:p>
+      <w:pPr>
+        <w:pStyle w:val="Compact"/>
+        <w:numPr>
+          <w:ilvl w:val="0"/>
+          <w:numId w:val="1029"/>
+        </w:numPr>
+      </w:pPr>
+      <w:r>
+        <w:rPr>
+          <w:b/>
+          <w:bCs/>
+        </w:rPr>
+        <w:t xml:space="preserve">7a. Sample size</w:t>
+      </w:r>
+      <w:r>
+        <w:t xml:space="preserve"> </w:t>
+      </w:r>
+      <w:r>
+        <w:t xml:space="preserve">— How it was determined.</w:t>
+      </w:r>
+    </w:p>
+    <w:p>
+      <w:pPr>
+        <w:pStyle w:val="Compact"/>
+        <w:numPr>
+          <w:ilvl w:val="0"/>
+          <w:numId w:val="1029"/>
+        </w:numPr>
+      </w:pPr>
+      <w:r>
+        <w:rPr>
+          <w:b/>
+          <w:bCs/>
+        </w:rPr>
+        <w:t xml:space="preserve">7b. Interim analyses / stopping</w:t>
+      </w:r>
+      <w:r>
+        <w:t xml:space="preserve"> </w:t>
+      </w:r>
+      <w:r>
+        <w:t xml:space="preserve">— When applicable, interim analyses and stopping guidelines.</w:t>
+      </w:r>
+    </w:p>
+    <w:p>
+      <w:pPr>
+        <w:pStyle w:val="Compact"/>
+        <w:numPr>
+          <w:ilvl w:val="0"/>
+          <w:numId w:val="1029"/>
+        </w:numPr>
+      </w:pPr>
+      <w:r>
+        <w:rPr>
+          <w:b/>
+          <w:bCs/>
+        </w:rPr>
+        <w:t xml:space="preserve">8a. Sequence generation</w:t>
+      </w:r>
+      <w:r>
+        <w:t xml:space="preserve"> </w:t>
+      </w:r>
+      <w:r>
+        <w:t xml:space="preserve">— Method used to generate the random allocation sequence.</w:t>
+      </w:r>
+    </w:p>
+    <w:p>
+      <w:pPr>
+        <w:pStyle w:val="Compact"/>
+        <w:numPr>
+          <w:ilvl w:val="0"/>
+          <w:numId w:val="1029"/>
+        </w:numPr>
+      </w:pPr>
+      <w:r>
+        <w:rPr>
+          <w:b/>
+          <w:bCs/>
+        </w:rPr>
+        <w:t xml:space="preserve">8b. Randomisation type</w:t>
+      </w:r>
+      <w:r>
+        <w:t xml:space="preserve"> </w:t>
+      </w:r>
+      <w:r>
+        <w:t xml:space="preserve">— Type of randomisation; details of any restriction (e.g. blocking, block size).</w:t>
+      </w:r>
+    </w:p>
+    <w:p>
+      <w:pPr>
+        <w:pStyle w:val="Compact"/>
+        <w:numPr>
+          <w:ilvl w:val="0"/>
+          <w:numId w:val="1029"/>
+        </w:numPr>
+      </w:pPr>
+      <w:r>
+        <w:rPr>
+          <w:b/>
+          <w:bCs/>
+        </w:rPr>
+        <w:t xml:space="preserve">9. Allocation concealment</w:t>
+      </w:r>
+      <w:r>
+        <w:t xml:space="preserve"> </w:t>
+      </w:r>
+      <w:r>
+        <w:t xml:space="preserve">— Mechanism used to implement the sequence, and steps taken to conceal it until interventions were assigned.</w:t>
+      </w:r>
+    </w:p>
+    <w:p>
+      <w:pPr>
+        <w:pStyle w:val="Compact"/>
+        <w:numPr>
+          <w:ilvl w:val="0"/>
+          <w:numId w:val="1029"/>
+        </w:numPr>
+      </w:pPr>
+      <w:r>
+        <w:rPr>
+          <w:b/>
+          <w:bCs/>
+        </w:rPr>
+        <w:t xml:space="preserve">10. Implementation</w:t>
+      </w:r>
+      <w:r>
+        <w:t xml:space="preserve"> </w:t>
+      </w:r>
+      <w:r>
+        <w:t xml:space="preserve">— Who generated the sequence, who enrolled participants, and who assigned them to interventions.</w:t>
+      </w:r>
+    </w:p>
+    <w:p>
+      <w:pPr>
+        <w:pStyle w:val="Compact"/>
+        <w:numPr>
+          <w:ilvl w:val="0"/>
+          <w:numId w:val="1029"/>
+        </w:numPr>
+      </w:pPr>
+      <w:r>
+        <w:rPr>
+          <w:b/>
+          <w:bCs/>
+        </w:rPr>
+        <w:t xml:space="preserve">11a. Blinding</w:t>
+      </w:r>
+      <w:r>
+        <w:t xml:space="preserve"> </w:t>
+      </w:r>
+      <w:r>
+        <w:t xml:space="preserve">— If done, who was blinded after assignment (participants, care providers, outcome assessors) and how.</w:t>
+      </w:r>
+    </w:p>
+    <w:p>
+      <w:pPr>
+        <w:pStyle w:val="Compact"/>
+        <w:numPr>
+          <w:ilvl w:val="0"/>
+          <w:numId w:val="1029"/>
+        </w:numPr>
+      </w:pPr>
+      <w:r>
+        <w:rPr>
+          <w:b/>
+          <w:bCs/>
+        </w:rPr>
+        <w:t xml:space="preserve">11b. Similarity of interventions</w:t>
+      </w:r>
+      <w:r>
+        <w:t xml:space="preserve"> </w:t>
+      </w:r>
+      <w:r>
+        <w:t xml:space="preserve">— If relevant, description of the similarity of interventions.</w:t>
+      </w:r>
+    </w:p>
+    <w:p>
+      <w:pPr>
+        <w:pStyle w:val="Compact"/>
+        <w:numPr>
+          <w:ilvl w:val="0"/>
+          <w:numId w:val="1029"/>
+        </w:numPr>
+      </w:pPr>
+      <w:r>
+        <w:rPr>
+          <w:b/>
+          <w:bCs/>
+        </w:rPr>
+        <w:t xml:space="preserve">12a. Statistical methods</w:t>
+      </w:r>
+      <w:r>
+        <w:t xml:space="preserve"> </w:t>
+      </w:r>
+      <w:r>
+        <w:t xml:space="preserve">— Methods used to compare groups for primary and secondary outcomes.</w:t>
+      </w:r>
+    </w:p>
+    <w:p>
+      <w:pPr>
+        <w:pStyle w:val="Compact"/>
+        <w:numPr>
+          <w:ilvl w:val="0"/>
+          <w:numId w:val="1029"/>
+        </w:numPr>
+      </w:pPr>
+      <w:r>
+        <w:rPr>
+          <w:b/>
+          <w:bCs/>
+        </w:rPr>
+        <w:t xml:space="preserve">12b. Additional analyses</w:t>
+      </w:r>
+      <w:r>
+        <w:t xml:space="preserve"> </w:t>
+      </w:r>
+      <w:r>
+        <w:t xml:space="preserve">— Methods for subgroup and adjusted analyses.</w:t>
+      </w:r>
+    </w:p>
+    <w:bookmarkEnd w:id="50"/>
+    <w:bookmarkStart w:id="51" w:name="results-1"/>
+    <w:p>
+      <w:pPr>
+        <w:pStyle w:val="Heading2"/>
+      </w:pPr>
+      <w:r>
+        <w:t xml:space="preserve">Results</w:t>
+      </w:r>
+    </w:p>
+    <w:p>
+      <w:pPr>
+        <w:pStyle w:val="Compact"/>
+        <w:numPr>
+          <w:ilvl w:val="0"/>
+          <w:numId w:val="1030"/>
+        </w:numPr>
+      </w:pPr>
+      <w:r>
+        <w:rPr>
+          <w:b/>
+          <w:bCs/>
+        </w:rPr>
+        <w:t xml:space="preserve">13a. Participant flow</w:t>
+      </w:r>
+      <w:r>
+        <w:t xml:space="preserve"> </w:t>
+      </w:r>
+      <w:r>
+        <w:t xml:space="preserve">— For each group, numbers randomised, receiving intended treatment, and analysed for the primary outcome (a flow diagram is strongly recommended).</w:t>
+      </w:r>
+    </w:p>
+    <w:p>
+      <w:pPr>
+        <w:pStyle w:val="Compact"/>
+        <w:numPr>
+          <w:ilvl w:val="0"/>
+          <w:numId w:val="1030"/>
+        </w:numPr>
+      </w:pPr>
+      <w:r>
+        <w:rPr>
+          <w:b/>
+          <w:bCs/>
+        </w:rPr>
+        <w:t xml:space="preserve">13b. Losses / exclusions</w:t>
+      </w:r>
+      <w:r>
+        <w:t xml:space="preserve"> </w:t>
+      </w:r>
+      <w:r>
+        <w:t xml:space="preserve">— For each group, losses and exclusions after randomisation, with reasons.</w:t>
+      </w:r>
+    </w:p>
+    <w:p>
+      <w:pPr>
+        <w:pStyle w:val="Compact"/>
+        <w:numPr>
+          <w:ilvl w:val="0"/>
+          <w:numId w:val="1030"/>
+        </w:numPr>
+      </w:pPr>
+      <w:r>
+        <w:rPr>
+          <w:b/>
+          <w:bCs/>
+        </w:rPr>
+        <w:t xml:space="preserve">14a. Recruitment</w:t>
+      </w:r>
+      <w:r>
+        <w:t xml:space="preserve"> </w:t>
+      </w:r>
+      <w:r>
+        <w:t xml:space="preserve">— Dates defining the periods of recruitment and follow-up.</w:t>
+      </w:r>
+    </w:p>
+    <w:p>
+      <w:pPr>
+        <w:pStyle w:val="Compact"/>
+        <w:numPr>
+          <w:ilvl w:val="0"/>
+          <w:numId w:val="1030"/>
+        </w:numPr>
+      </w:pPr>
+      <w:r>
+        <w:rPr>
+          <w:b/>
+          <w:bCs/>
+        </w:rPr>
+        <w:t xml:space="preserve">14b. Trial end</w:t>
+      </w:r>
+      <w:r>
+        <w:t xml:space="preserve"> </w:t>
+      </w:r>
+      <w:r>
+        <w:t xml:space="preserve">— Why the trial ended or was stopped.</w:t>
+      </w:r>
+    </w:p>
+    <w:p>
+      <w:pPr>
+        <w:pStyle w:val="Compact"/>
+        <w:numPr>
+          <w:ilvl w:val="0"/>
+          <w:numId w:val="1030"/>
+        </w:numPr>
+      </w:pPr>
+      <w:r>
+        <w:rPr>
+          <w:b/>
+          <w:bCs/>
+        </w:rPr>
+        <w:t xml:space="preserve">15. Baseline data</w:t>
+      </w:r>
+      <w:r>
+        <w:t xml:space="preserve"> </w:t>
+      </w:r>
+      <w:r>
+        <w:t xml:space="preserve">— A table of baseline demographic and clinical characteristics for each group.</w:t>
+      </w:r>
+    </w:p>
+    <w:p>
+      <w:pPr>
+        <w:pStyle w:val="Compact"/>
+        <w:numPr>
+          <w:ilvl w:val="0"/>
+          <w:numId w:val="1030"/>
+        </w:numPr>
+      </w:pPr>
+      <w:r>
+        <w:rPr>
+          <w:b/>
+          <w:bCs/>
+        </w:rPr>
+        <w:t xml:space="preserve">16. Numbers analysed</w:t>
+      </w:r>
+      <w:r>
+        <w:t xml:space="preserve"> </w:t>
+      </w:r>
+      <w:r>
+        <w:t xml:space="preserve">— For each group, number included in each analysis and whether by original assigned groups (intention-to-treat).</w:t>
+      </w:r>
+    </w:p>
+    <w:p>
+      <w:pPr>
+        <w:pStyle w:val="Compact"/>
+        <w:numPr>
+          <w:ilvl w:val="0"/>
+          <w:numId w:val="1030"/>
+        </w:numPr>
+      </w:pPr>
+      <w:r>
+        <w:rPr>
+          <w:b/>
+          <w:bCs/>
+        </w:rPr>
+        <w:t xml:space="preserve">17a. Outcomes and estimation</w:t>
+      </w:r>
+      <w:r>
+        <w:t xml:space="preserve"> </w:t>
+      </w:r>
+      <w:r>
+        <w:t xml:space="preserve">— For each outcome, results per group and the estimated effect size with its precision (e.g. 95% CI).</w:t>
+      </w:r>
+    </w:p>
+    <w:p>
+      <w:pPr>
+        <w:pStyle w:val="Compact"/>
+        <w:numPr>
+          <w:ilvl w:val="0"/>
+          <w:numId w:val="1030"/>
+        </w:numPr>
+      </w:pPr>
+      <w:r>
+        <w:rPr>
+          <w:b/>
+          <w:bCs/>
+        </w:rPr>
+        <w:t xml:space="preserve">17b. Absolute and relative effects</w:t>
+      </w:r>
+      <w:r>
+        <w:t xml:space="preserve"> </w:t>
+      </w:r>
+      <w:r>
+        <w:t xml:space="preserve">— For binary outcomes, presentation of both is recommended.</w:t>
+      </w:r>
+    </w:p>
+    <w:p>
+      <w:pPr>
+        <w:pStyle w:val="Compact"/>
+        <w:numPr>
+          <w:ilvl w:val="0"/>
+          <w:numId w:val="1030"/>
+        </w:numPr>
+      </w:pPr>
+      <w:r>
+        <w:rPr>
+          <w:b/>
+          <w:bCs/>
+        </w:rPr>
+        <w:t xml:space="preserve">18. Ancillary analyses</w:t>
+      </w:r>
+      <w:r>
+        <w:t xml:space="preserve"> </w:t>
+      </w:r>
+      <w:r>
+        <w:t xml:space="preserve">— Other analyses performed, distinguishing pre-specified from exploratory.</w:t>
+      </w:r>
+    </w:p>
+    <w:p>
+      <w:pPr>
+        <w:pStyle w:val="Compact"/>
+        <w:numPr>
+          <w:ilvl w:val="0"/>
+          <w:numId w:val="1030"/>
+        </w:numPr>
+      </w:pPr>
+      <w:r>
+        <w:rPr>
+          <w:b/>
+          <w:bCs/>
+        </w:rPr>
+        <w:t xml:space="preserve">19. Harms</w:t>
+      </w:r>
+      <w:r>
+        <w:t xml:space="preserve"> </w:t>
+      </w:r>
+      <w:r>
+        <w:t xml:space="preserve">— All important harms or unintended effects in each group (see CONSORT for Harms).</w:t>
+      </w:r>
+    </w:p>
+    <w:bookmarkEnd w:id="51"/>
+    <w:bookmarkStart w:id="52" w:name="discussion-1"/>
+    <w:p>
+      <w:pPr>
+        <w:pStyle w:val="Heading2"/>
+      </w:pPr>
+      <w:r>
+        <w:t xml:space="preserve">Discussion</w:t>
+      </w:r>
+    </w:p>
+    <w:p>
+      <w:pPr>
+        <w:pStyle w:val="Compact"/>
+        <w:numPr>
+          <w:ilvl w:val="0"/>
+          <w:numId w:val="1031"/>
+        </w:numPr>
+      </w:pPr>
+      <w:r>
+        <w:rPr>
+          <w:b/>
+          <w:bCs/>
+        </w:rPr>
+        <w:t xml:space="preserve">20. Limitations</w:t>
+      </w:r>
+      <w:r>
+        <w:t xml:space="preserve"> </w:t>
+      </w:r>
+      <w:r>
+        <w:t xml:space="preserve">— Sources of potential bias, imprecision, and, if relevant, multiplicity of analyses.</w:t>
+      </w:r>
+    </w:p>
+    <w:p>
+      <w:pPr>
+        <w:pStyle w:val="Compact"/>
+        <w:numPr>
+          <w:ilvl w:val="0"/>
+          <w:numId w:val="1031"/>
+        </w:numPr>
+      </w:pPr>
+      <w:r>
+        <w:rPr>
+          <w:b/>
+          <w:bCs/>
+        </w:rPr>
+        <w:t xml:space="preserve">21. Generalisability</w:t>
+      </w:r>
+      <w:r>
+        <w:t xml:space="preserve"> </w:t>
+      </w:r>
+      <w:r>
+        <w:t xml:space="preserve">— External validity / applicability of the findings.</w:t>
+      </w:r>
+    </w:p>
+    <w:p>
+      <w:pPr>
+        <w:pStyle w:val="Compact"/>
+        <w:numPr>
+          <w:ilvl w:val="0"/>
+          <w:numId w:val="1031"/>
+        </w:numPr>
+      </w:pPr>
+      <w:r>
+        <w:rPr>
+          <w:b/>
+          <w:bCs/>
+        </w:rPr>
+        <w:t xml:space="preserve">22. Interpretation</w:t>
+      </w:r>
+      <w:r>
+        <w:t xml:space="preserve"> </w:t>
+      </w:r>
+      <w:r>
+        <w:t xml:space="preserve">— Consistent with results, balancing benefits and harms, and considering other relevant evidence.</w:t>
+      </w:r>
+    </w:p>
+    <w:bookmarkEnd w:id="52"/>
+    <w:bookmarkStart w:id="53" w:name="other-information-1"/>
+    <w:p>
+      <w:pPr>
+        <w:pStyle w:val="Heading2"/>
+      </w:pPr>
+      <w:r>
+        <w:t xml:space="preserve">Other information</w:t>
+      </w:r>
+    </w:p>
+    <w:p>
+      <w:pPr>
+        <w:pStyle w:val="Compact"/>
+        <w:numPr>
+          <w:ilvl w:val="0"/>
+          <w:numId w:val="1032"/>
+        </w:numPr>
+      </w:pPr>
+      <w:r>
+        <w:rPr>
+          <w:b/>
+          <w:bCs/>
+        </w:rPr>
+        <w:t xml:space="preserve">23. Registration</w:t>
+      </w:r>
+      <w:r>
+        <w:t xml:space="preserve"> </w:t>
+      </w:r>
+      <w:r>
+        <w:t xml:space="preserve">— Registration number and name of trial registry.</w:t>
+      </w:r>
+    </w:p>
+    <w:p>
+      <w:pPr>
+        <w:pStyle w:val="Compact"/>
+        <w:numPr>
+          <w:ilvl w:val="0"/>
+          <w:numId w:val="1032"/>
+        </w:numPr>
+      </w:pPr>
+      <w:r>
+        <w:rPr>
+          <w:b/>
+          <w:bCs/>
+        </w:rPr>
+        <w:t xml:space="preserve">24. Protocol</w:t>
+      </w:r>
+      <w:r>
+        <w:t xml:space="preserve"> </w:t>
+      </w:r>
+      <w:r>
+        <w:t xml:space="preserve">— Where the full trial protocol can be accessed, if available.</w:t>
+      </w:r>
+    </w:p>
+    <w:p>
+      <w:pPr>
+        <w:pStyle w:val="Compact"/>
+        <w:numPr>
+          <w:ilvl w:val="0"/>
+          <w:numId w:val="1032"/>
+        </w:numPr>
+      </w:pPr>
+      <w:r>
+        <w:rPr>
+          <w:b/>
+          <w:bCs/>
+        </w:rPr>
+        <w:t xml:space="preserve">25. Funding</w:t>
+      </w:r>
+      <w:r>
+        <w:t xml:space="preserve"> </w:t>
+      </w:r>
+      <w:r>
+        <w:t xml:space="preserve">— Sources of funding and other support (e.g. drug supply); role of funders.</w:t>
+      </w:r>
+    </w:p>
+    <w:bookmarkEnd w:id="53"/>
+    <w:bookmarkStart w:id="54" w:name="judgement-notes-5"/>
+    <w:p>
+      <w:pPr>
+        <w:pStyle w:val="Heading2"/>
+      </w:pPr>
+      <w:r>
+        <w:t xml:space="preserve">Judgement notes</w:t>
+      </w:r>
+    </w:p>
+    <w:p>
+      <w:pPr>
+        <w:pStyle w:val="Compact"/>
+        <w:numPr>
+          <w:ilvl w:val="0"/>
+          <w:numId w:val="1033"/>
+        </w:numPr>
+      </w:pPr>
+      <w:r>
+        <w:rPr>
+          <w:b/>
+          <w:bCs/>
+        </w:rPr>
+        <w:t xml:space="preserve">CONSORT is reporting, not risk of bias.</w:t>
+      </w:r>
+      <w:r>
+        <w:t xml:space="preserve"> </w:t>
+      </w:r>
+      <w:r>
+        <w:t xml:space="preserve">To judge how much to trust a single</w:t>
+      </w:r>
+      <w:r>
+        <w:t xml:space="preserve"> </w:t>
+      </w:r>
+      <w:r>
+        <w:t xml:space="preserve">RCT’s results, use the Cochrane</w:t>
+      </w:r>
+      <w:r>
+        <w:t xml:space="preserve"> </w:t>
+      </w:r>
+      <w:r>
+        <w:rPr>
+          <w:b/>
+          <w:bCs/>
+        </w:rPr>
+        <w:t xml:space="preserve">RoB 2</w:t>
+      </w:r>
+      <w:r>
+        <w:t xml:space="preserve"> </w:t>
+      </w:r>
+      <w:r>
+        <w:t xml:space="preserve">tool (randomisation, deviations from</w:t>
+      </w:r>
+      <w:r>
+        <w:t xml:space="preserve"> </w:t>
+      </w:r>
+      <w:r>
+        <w:t xml:space="preserve">intended intervention, missing outcome data, outcome measurement, selective</w:t>
+      </w:r>
+      <w:r>
+        <w:t xml:space="preserve"> </w:t>
+      </w:r>
+      <w:r>
+        <w:t xml:space="preserve">reporting). RoB 2 is the companion appraisal tool for individual trials — it is</w:t>
+      </w:r>
+      <w:r>
+        <w:t xml:space="preserve"> </w:t>
+      </w:r>
+      <w:r>
+        <w:rPr>
+          <w:b/>
+          <w:bCs/>
+        </w:rPr>
+        <w:t xml:space="preserve">not</w:t>
+      </w:r>
+      <w:r>
+        <w:t xml:space="preserve"> </w:t>
+      </w:r>
+      <w:r>
+        <w:t xml:space="preserve">bundled in this skill (a candidate future addition); flag when it is needed.</w:t>
+      </w:r>
+    </w:p>
+    <w:p>
+      <w:pPr>
+        <w:pStyle w:val="Compact"/>
+        <w:numPr>
+          <w:ilvl w:val="0"/>
+          <w:numId w:val="1033"/>
+        </w:numPr>
+      </w:pPr>
+      <w:r>
+        <w:rPr>
+          <w:b/>
+          <w:bCs/>
+        </w:rPr>
+        <w:t xml:space="preserve">CONSORT vs SPIRIT vs PRISMA.</w:t>
+      </w:r>
+      <w:r>
+        <w:t xml:space="preserve"> </w:t>
+      </w:r>
+      <w:r>
+        <w:t xml:space="preserve">SPIRIT governs the trial</w:t>
+      </w:r>
+      <w:r>
+        <w:t xml:space="preserve"> </w:t>
+      </w:r>
+      <w:r>
+        <w:rPr>
+          <w:i/>
+          <w:iCs/>
+        </w:rPr>
+        <w:t xml:space="preserve">protocol</w:t>
+      </w:r>
+      <w:r>
+        <w:t xml:space="preserve"> </w:t>
+      </w:r>
+      <w:r>
+        <w:t xml:space="preserve">(planned);</w:t>
+      </w:r>
+      <w:r>
+        <w:t xml:space="preserve"> </w:t>
+      </w:r>
+      <w:r>
+        <w:t xml:space="preserve">CONSORT governs the completed</w:t>
+      </w:r>
+      <w:r>
+        <w:t xml:space="preserve"> </w:t>
+      </w:r>
+      <w:r>
+        <w:rPr>
+          <w:i/>
+          <w:iCs/>
+        </w:rPr>
+        <w:t xml:space="preserve">trial report</w:t>
+      </w:r>
+      <w:r>
+        <w:t xml:space="preserve"> </w:t>
+      </w:r>
+      <w:r>
+        <w:t xml:space="preserve">(done); PRISMA governs</w:t>
+      </w:r>
+      <w:r>
+        <w:t xml:space="preserve"> </w:t>
+      </w:r>
+      <w:r>
+        <w:rPr>
+          <w:i/>
+          <w:iCs/>
+        </w:rPr>
+        <w:t xml:space="preserve">reviews</w:t>
+      </w:r>
+      <w:r>
+        <w:t xml:space="preserve"> </w:t>
+      </w:r>
+      <w:r>
+        <w:t xml:space="preserve">of</w:t>
+      </w:r>
+      <w:r>
+        <w:t xml:space="preserve"> </w:t>
+      </w:r>
+      <w:r>
+        <w:t xml:space="preserve">many trials. Route by what the document actually is.</w:t>
+      </w:r>
+    </w:p>
+    <w:p>
+      <w:pPr>
+        <w:pStyle w:val="Compact"/>
+        <w:numPr>
+          <w:ilvl w:val="0"/>
+          <w:numId w:val="1033"/>
+        </w:numPr>
+      </w:pPr>
+      <w:r>
+        <w:rPr>
+          <w:b/>
+          <w:bCs/>
+        </w:rPr>
+        <w:t xml:space="preserve">Common gaps:</w:t>
+      </w:r>
+      <w:r>
+        <w:t xml:space="preserve"> </w:t>
+      </w:r>
+      <w:r>
+        <w:t xml:space="preserve">9 (allocation-concealment mechanism, distinct from sequence</w:t>
+      </w:r>
+      <w:r>
+        <w:t xml:space="preserve"> </w:t>
+      </w:r>
+      <w:r>
+        <w:t xml:space="preserve">generation), 11 (who was blinded and how), 13b (post-randomisation losses with</w:t>
+      </w:r>
+      <w:r>
+        <w:t xml:space="preserve"> </w:t>
+      </w:r>
+      <w:r>
+        <w:t xml:space="preserve">reasons), 16 (intention-to-treat denominators), 17b (absolute effects), 24</w:t>
+      </w:r>
+      <w:r>
+        <w:t xml:space="preserve"> </w:t>
+      </w:r>
+      <w:r>
+        <w:t xml:space="preserve">(protocol access).</w:t>
+      </w:r>
+    </w:p>
+    <w:p>
+      <w:pPr>
+        <w:pStyle w:val="Compact"/>
+        <w:numPr>
+          <w:ilvl w:val="0"/>
+          <w:numId w:val="1033"/>
+        </w:numPr>
+      </w:pPr>
+      <w:r>
+        <w:rPr>
+          <w:b/>
+          <w:bCs/>
+        </w:rPr>
+        <w:t xml:space="preserve">Extensions exist</w:t>
+      </w:r>
+      <w:r>
+        <w:t xml:space="preserve"> </w:t>
+      </w:r>
+      <w:r>
+        <w:t xml:space="preserve">(cluster, non-inferiority/equivalence, pragmatic, pilot/</w:t>
+      </w:r>
+      <w:r>
+        <w:t xml:space="preserve"> </w:t>
+      </w:r>
+      <w:r>
+        <w:t xml:space="preserve">feasibility, harms, PROs, abstracts). This file covers base CONSORT 2010 for</w:t>
+      </w:r>
+      <w:r>
+        <w:t xml:space="preserve"> </w:t>
+      </w:r>
+      <w:r>
+        <w:t xml:space="preserve">parallel-group trials — note if an extension applies.</w:t>
+      </w:r>
+    </w:p>
+    <w:bookmarkEnd w:id="54"/>
+    <w:bookmarkEnd w:id="55"/>
     <w:sectPr>
       <w:footnotePr>
         <w:numRestart w:val="eachSect"/>
@@ -6194,6 +7415,27 @@
     <w:abstractNumId w:val="991"/>
   </w:num>
   <w:num w:numId="1026">
+    <w:abstractNumId w:val="991"/>
+  </w:num>
+  <w:num w:numId="1027">
+    <w:abstractNumId w:val="991"/>
+  </w:num>
+  <w:num w:numId="1028">
+    <w:abstractNumId w:val="991"/>
+  </w:num>
+  <w:num w:numId="1029">
+    <w:abstractNumId w:val="991"/>
+  </w:num>
+  <w:num w:numId="1030">
+    <w:abstractNumId w:val="991"/>
+  </w:num>
+  <w:num w:numId="1031">
+    <w:abstractNumId w:val="991"/>
+  </w:num>
+  <w:num w:numId="1032">
+    <w:abstractNumId w:val="991"/>
+  </w:num>
+  <w:num w:numId="1033">
     <w:abstractNumId w:val="991"/>
   </w:num>
 </w:numbering>

</xml_diff>